<commit_message>
Fix pipeline cleanup and password prompt race; update submission materials
</commit_message>
<xml_diff>
--- a/report/Advanced_Shell_Deliverable_4_Report.docx
+++ b/report/Advanced_Shell_Deliverable_4_Report.docx
@@ -183,7 +183,7 @@
           <w:color w:val="000000"/>
           <w:sz w:val="24"/>
         </w:rPr>
-        <w:t>Deliverable 4 combines the earlier shell components with command pipelines, authenticated sessions, and simulated file authorization. My main design decision was to keep the existing module interfaces and add checks where commands enter the execution path. This allows a pipeline such as cat shared/events.txt | grep error | sort to coexist with Round Robin scheduling, priority scheduling, paging, and the producer-consumer demonstration in one shell. The completed implementation passes 70 integration tests and the parser and scheduler unit suites on macOS.</w:t>
+        <w:t>Deliverable 4 combines the earlier shell components with command pipelines, authenticated sessions, and simulated file authorization. My main design decision was to keep the existing module interfaces and add checks where commands enter the execution path. This allows a pipeline such as cat shared/events.txt | grep error | sort to coexist with Round Robin scheduling, priority scheduling, paging, and the producer-consumer demonstration in one shell. The completed implementation passes 71 integration tests and the parser and scheduler unit suites on macOS.</w:t>
       </w:r>
     </w:p>
     <w:p>
@@ -1088,7 +1088,7 @@
           <w:color w:val="000000"/>
           <w:sz w:val="24"/>
         </w:rPr>
-        <w:t>The coordinator and stages inherit a single D1 job process group. Foreground terminal assignment, Ctrl+Z, bg, fg, and Ctrl+C therefore work on the complete pipeline. The coordinator ignores interrupt, quit, and hangup while its stages use default dispositions, allowing it to reap terminated stages. It retains the normal stop disposition so group suspension is visible to the parent shell. Pipeline completion returns the last stage status, matching the chosen traditional shell behavior; a failed earlier stage does not imply pipefail.</w:t>
+        <w:t>One D1 process group contains the coordinator and all stages. Foreground terminal assignment, Ctrl+Z, bg, fg, and Ctrl+C apply to the whole pipeline. The coordinator ignores interrupt, quit, hangup, and termination signals while stages use default dispositions, so it can reap them. Its normal stop disposition exposes group suspension to the shell. The kill built-in maps a tracked job PID to its group and continues stopped jobs to deliver termination. Completion returns the last stage status; failures in earlier stages do not enable pipefail.</w:t>
       </w:r>
     </w:p>
     <w:p>
@@ -1146,7 +1146,7 @@
           <w:color w:val="000000"/>
           <w:sz w:val="24"/>
         </w:rPr>
-        <w:t>Before the command loop begins, the shell asks for a username and password. Provisioning creates separate admin, student, and guest accounts; the latter two have standard roles. There are no shipped default passwords or command-line password options. Password input uses terminal echo suppression and restores the previous mode afterward. Three failed attempts end the process. Unknown usernames receive the same failure response and perform the same password-derivation work as known accounts.</w:t>
+        <w:t>Before the command loop begins, the shell asks for a username and password. Provisioning creates separate admin, student, and guest accounts; the latter two have standard roles. There are no shipped default passwords or command-line password options. Password input disables terminal echo before displaying its prompt and restores the previous mode afterward. Three failed attempts end the process. Unknown usernames receive the same failure response and perform the same password-derivation work as known accounts.</w:t>
       </w:r>
     </w:p>
     <w:p>
@@ -1319,7 +1319,7 @@
           <w:color w:val="000000"/>
           <w:sz w:val="24"/>
         </w:rPr>
-        <w:t>The 70 integration tests include 20 inherited D1 process and terminal tests, four D2 scheduler integration tests, 20 D3 memory and synchronization tests, and 26 D4 tests. The D2 randomized oracle still checks 40 workloads under both policies. The D4 suite verifies login failure and retry, separate identities, hidden terminal passwords, permission persistence, private homes, path and symlink escape attempts, external-command bypass attempts, concurrent-session rejection, and pipeline terminal controls. The 26 D4 tests also pass with AddressSanitizer and UndefinedBehaviorSanitizer enabled.</w:t>
+        <w:t>The 71 integration tests comprise 20 D1 process and terminal tests, four D2 scheduler tests, 20 D3 memory and synchronization tests, and 27 D4 tests. The D2 oracle checks 40 workloads under both policies. D4 covers failed and retried login, distinct identities, hidden passwords, persistent permissions, private homes, path and symlink escapes, external-command bypass attempts, session locking, and pipeline job control. A regression test kills running and stopped pipelines and verifies that all stages exit. All 27 D4 tests pass under AddressSanitizer and UndefinedBehaviorSanitizer.</w:t>
       </w:r>
     </w:p>
     <w:p>

</xml_diff>